<commit_message>
resume content updated for sr engineer roles
</commit_message>
<xml_diff>
--- a/resume/WORD/my-project-details.docx
+++ b/resume/WORD/my-project-details.docx
@@ -1053,47 +1053,7 @@
           <w:sz w:val="23"/>
           <w:szCs w:val="23"/>
         </w:rPr>
-        <w:t xml:space="preserve"> orders and track orders information from </w:t>
-      </w:r>
-      <w:proofErr w:type="gramStart"/>
-      <w:r>
-        <w:rPr>
-          <w:rFonts w:ascii="Times New Roman" w:eastAsia="Times New Roman" w:hAnsi="Times New Roman" w:cs="Times New Roman"/>
-          <w:color w:val="000000"/>
-          <w:sz w:val="23"/>
-          <w:szCs w:val="23"/>
-        </w:rPr>
-        <w:t>amazon ,</w:t>
-      </w:r>
-      <w:proofErr w:type="gramEnd"/>
-      <w:r>
-        <w:rPr>
-          <w:rFonts w:ascii="Times New Roman" w:eastAsia="Times New Roman" w:hAnsi="Times New Roman" w:cs="Times New Roman"/>
-          <w:color w:val="000000"/>
-          <w:sz w:val="23"/>
-          <w:szCs w:val="23"/>
-        </w:rPr>
-        <w:t xml:space="preserve"> </w:t>
-      </w:r>
-      <w:proofErr w:type="gramStart"/>
-      <w:r>
-        <w:rPr>
-          <w:rFonts w:ascii="Times New Roman" w:eastAsia="Times New Roman" w:hAnsi="Times New Roman" w:cs="Times New Roman"/>
-          <w:color w:val="000000"/>
-          <w:sz w:val="23"/>
-          <w:szCs w:val="23"/>
-        </w:rPr>
-        <w:t>eBay ,Valore</w:t>
-      </w:r>
-      <w:proofErr w:type="gramEnd"/>
-      <w:r>
-        <w:rPr>
-          <w:rFonts w:ascii="Times New Roman" w:eastAsia="Times New Roman" w:hAnsi="Times New Roman" w:cs="Times New Roman"/>
-          <w:color w:val="000000"/>
-          <w:sz w:val="23"/>
-          <w:szCs w:val="23"/>
-        </w:rPr>
-        <w:t xml:space="preserve"> and </w:t>
+        <w:t xml:space="preserve"> orders and track orders information from amazon , eBay ,Valore and </w:t>
       </w:r>
       <w:proofErr w:type="spellStart"/>
       <w:r>
@@ -1808,60 +1768,42 @@
           <w:color w:val="000000"/>
           <w:sz w:val="23"/>
         </w:rPr>
-        <w:t xml:space="preserve"> Provides the </w:t>
-      </w:r>
-      <w:proofErr w:type="gramStart"/>
-      <w:r>
+        <w:t xml:space="preserve"> Provides the real time product suggestion based on interest captured from the customers.</w:t>
+      </w:r>
+    </w:p>
+    <w:p>
+      <w:pPr>
         <w:rPr>
           <w:rFonts w:ascii="Times New Roman" w:hAnsi="Times New Roman" w:cs="Times New Roman"/>
           <w:color w:val="000000"/>
           <w:sz w:val="23"/>
         </w:rPr>
-        <w:t>real time</w:t>
-      </w:r>
-      <w:proofErr w:type="gramEnd"/>
-      <w:r>
+      </w:pPr>
+      <w:r>
+        <w:rPr>
+          <w:rFonts w:ascii="Times New Roman" w:hAnsi="Times New Roman" w:cs="Times New Roman"/>
+          <w:b/>
+          <w:color w:val="000000"/>
+          <w:sz w:val="23"/>
+          <w:u w:val="single"/>
+        </w:rPr>
+        <w:t>Decision Making System</w:t>
+      </w:r>
+    </w:p>
+    <w:p>
+      <w:pPr>
         <w:rPr>
           <w:rFonts w:ascii="Times New Roman" w:hAnsi="Times New Roman" w:cs="Times New Roman"/>
           <w:color w:val="000000"/>
           <w:sz w:val="23"/>
         </w:rPr>
-        <w:t xml:space="preserve"> product suggestion based on interest captured from the customers.</w:t>
-      </w:r>
-    </w:p>
-    <w:p>
-      <w:pPr>
+      </w:pPr>
+      <w:r>
         <w:rPr>
           <w:rFonts w:ascii="Times New Roman" w:hAnsi="Times New Roman" w:cs="Times New Roman"/>
           <w:color w:val="000000"/>
           <w:sz w:val="23"/>
         </w:rPr>
-      </w:pPr>
-      <w:r>
-        <w:rPr>
-          <w:rFonts w:ascii="Times New Roman" w:hAnsi="Times New Roman" w:cs="Times New Roman"/>
-          <w:b/>
-          <w:color w:val="000000"/>
-          <w:sz w:val="23"/>
-          <w:u w:val="single"/>
-        </w:rPr>
-        <w:t>Decision Making System</w:t>
-      </w:r>
-    </w:p>
-    <w:p>
-      <w:pPr>
-        <w:rPr>
-          <w:rFonts w:ascii="Times New Roman" w:hAnsi="Times New Roman" w:cs="Times New Roman"/>
-          <w:color w:val="000000"/>
-          <w:sz w:val="23"/>
-        </w:rPr>
-      </w:pPr>
-      <w:r>
-        <w:rPr>
-          <w:rFonts w:ascii="Times New Roman" w:hAnsi="Times New Roman" w:cs="Times New Roman"/>
-          <w:color w:val="000000"/>
-          <w:sz w:val="23"/>
-        </w:rPr>
         <w:lastRenderedPageBreak/>
         <w:t>This system determines banking product decisions based on client feedback before implementation.</w:t>
       </w:r>
@@ -1899,23 +1841,13 @@
           <w:shd w:val="clear" w:color="auto" w:fill="FFFFFF"/>
         </w:rPr>
       </w:pPr>
-      <w:proofErr w:type="gramStart"/>
       <w:r>
         <w:rPr>
           <w:rFonts w:ascii="Times New Roman" w:hAnsi="Times New Roman"/>
           <w:sz w:val="23"/>
           <w:shd w:val="clear" w:color="auto" w:fill="FFFFFF"/>
         </w:rPr>
-        <w:t>Analyzed</w:t>
-      </w:r>
-      <w:proofErr w:type="gramEnd"/>
-      <w:r>
-        <w:rPr>
-          <w:rFonts w:ascii="Times New Roman" w:hAnsi="Times New Roman"/>
-          <w:sz w:val="23"/>
-          <w:shd w:val="clear" w:color="auto" w:fill="FFFFFF"/>
-        </w:rPr>
-        <w:t xml:space="preserve"> client requirements, designed web application architecture (GUI, business, data access tiers), and developed related components.</w:t>
+        <w:t>Analyzed client requirements, designed web application architecture (GUI, business, data access tiers), and developed related components.</w:t>
       </w:r>
     </w:p>
     <w:p>
@@ -2503,21 +2435,12 @@
           <w:sz w:val="23"/>
         </w:rPr>
       </w:pPr>
-      <w:proofErr w:type="gramStart"/>
-      <w:r>
-        <w:rPr>
-          <w:rFonts w:ascii="Times New Roman" w:hAnsi="Times New Roman"/>
-          <w:sz w:val="23"/>
-        </w:rPr>
-        <w:t>Provided assistance to</w:t>
-      </w:r>
-      <w:proofErr w:type="gramEnd"/>
-      <w:r>
-        <w:rPr>
-          <w:rFonts w:ascii="Times New Roman" w:hAnsi="Times New Roman"/>
-          <w:sz w:val="23"/>
-        </w:rPr>
-        <w:t xml:space="preserve"> PFE and partners in resolving issues related to Active Directory and MIM sync services.</w:t>
+      <w:r>
+        <w:rPr>
+          <w:rFonts w:ascii="Times New Roman" w:hAnsi="Times New Roman"/>
+          <w:sz w:val="23"/>
+        </w:rPr>
+        <w:t>Provided assistance to PFE and partners in resolving issues related to Active Directory and MIM sync services.</w:t>
       </w:r>
     </w:p>
     <w:p>
@@ -2581,23 +2504,7 @@
           <w:rFonts w:ascii="Times New Roman" w:hAnsi="Times New Roman"/>
           <w:sz w:val="23"/>
         </w:rPr>
-        <w:t xml:space="preserve">Coordinated VM and SQL backup planning sessions with PFE and product </w:t>
-      </w:r>
-      <w:proofErr w:type="gramStart"/>
-      <w:r>
-        <w:rPr>
-          <w:rFonts w:ascii="Times New Roman" w:hAnsi="Times New Roman"/>
-          <w:sz w:val="23"/>
-        </w:rPr>
-        <w:t>teams, and</w:t>
-      </w:r>
-      <w:proofErr w:type="gramEnd"/>
-      <w:r>
-        <w:rPr>
-          <w:rFonts w:ascii="Times New Roman" w:hAnsi="Times New Roman"/>
-          <w:sz w:val="23"/>
-        </w:rPr>
-        <w:t xml:space="preserve"> participated in AD risk assessment reviews.</w:t>
+        <w:t>Coordinated VM and SQL backup planning sessions with PFE and product teams, and participated in AD risk assessment reviews.</w:t>
       </w:r>
     </w:p>
     <w:p>
@@ -3407,21 +3314,12 @@
           <w:sz w:val="23"/>
         </w:rPr>
       </w:pPr>
-      <w:proofErr w:type="gramStart"/>
-      <w:r>
-        <w:rPr>
-          <w:rFonts w:ascii="Times New Roman" w:hAnsi="Times New Roman"/>
-          <w:sz w:val="23"/>
-        </w:rPr>
-        <w:t>Attended</w:t>
-      </w:r>
-      <w:proofErr w:type="gramEnd"/>
-      <w:r>
-        <w:rPr>
-          <w:rFonts w:ascii="Times New Roman" w:hAnsi="Times New Roman"/>
-          <w:sz w:val="23"/>
-        </w:rPr>
-        <w:t xml:space="preserve"> IGD readiness, engineering workshops, and market trend learning sessions.</w:t>
+      <w:r>
+        <w:rPr>
+          <w:rFonts w:ascii="Times New Roman" w:hAnsi="Times New Roman"/>
+          <w:sz w:val="23"/>
+        </w:rPr>
+        <w:t>Attended IGD readiness, engineering workshops, and market trend learning sessions.</w:t>
       </w:r>
     </w:p>
     <w:p>
@@ -3580,21 +3478,12 @@
           <w:sz w:val="23"/>
         </w:rPr>
       </w:pPr>
-      <w:proofErr w:type="gramStart"/>
-      <w:r>
-        <w:rPr>
-          <w:rFonts w:ascii="Times New Roman" w:hAnsi="Times New Roman"/>
-          <w:sz w:val="23"/>
-        </w:rPr>
-        <w:t>Participated</w:t>
-      </w:r>
-      <w:proofErr w:type="gramEnd"/>
-      <w:r>
-        <w:rPr>
-          <w:rFonts w:ascii="Times New Roman" w:hAnsi="Times New Roman"/>
-          <w:sz w:val="23"/>
-        </w:rPr>
-        <w:t xml:space="preserve"> in the customer MVP program to discuss OKRs, EFUs, and architecture with onshore teams and customers in daily meetings for MVP design and implementation.</w:t>
+      <w:r>
+        <w:rPr>
+          <w:rFonts w:ascii="Times New Roman" w:hAnsi="Times New Roman"/>
+          <w:sz w:val="23"/>
+        </w:rPr>
+        <w:t>Participated in the customer MVP program to discuss OKRs, EFUs, and architecture with onshore teams and customers in daily meetings for MVP design and implementation.</w:t>
       </w:r>
     </w:p>
     <w:p>
@@ -4968,21 +4857,12 @@
           <w:sz w:val="23"/>
         </w:rPr>
       </w:pPr>
-      <w:proofErr w:type="gramStart"/>
-      <w:r>
-        <w:rPr>
-          <w:rFonts w:ascii="Times New Roman" w:hAnsi="Times New Roman"/>
-          <w:sz w:val="23"/>
-        </w:rPr>
-        <w:t>Assisted team members</w:t>
-      </w:r>
-      <w:proofErr w:type="gramEnd"/>
-      <w:r>
-        <w:rPr>
-          <w:rFonts w:ascii="Times New Roman" w:hAnsi="Times New Roman"/>
-          <w:sz w:val="23"/>
-        </w:rPr>
-        <w:t xml:space="preserve"> with technical challenges and customer requirements.</w:t>
+      <w:r>
+        <w:rPr>
+          <w:rFonts w:ascii="Times New Roman" w:hAnsi="Times New Roman"/>
+          <w:sz w:val="23"/>
+        </w:rPr>
+        <w:t>Assisted team members with technical challenges and customer requirements.</w:t>
       </w:r>
     </w:p>
     <w:p>
@@ -5077,23 +4957,7 @@
           <w:rFonts w:ascii="Times New Roman" w:hAnsi="Times New Roman"/>
           <w:sz w:val="23"/>
         </w:rPr>
-        <w:t xml:space="preserve">, specifically in implementing caching logic for Azure Functions. This ensured uninterrupted record processing and simultaneous </w:t>
-      </w:r>
-      <w:proofErr w:type="gramStart"/>
-      <w:r>
-        <w:rPr>
-          <w:rFonts w:ascii="Times New Roman" w:hAnsi="Times New Roman"/>
-          <w:sz w:val="23"/>
-        </w:rPr>
-        <w:t>caching</w:t>
-      </w:r>
-      <w:proofErr w:type="gramEnd"/>
-      <w:r>
-        <w:rPr>
-          <w:rFonts w:ascii="Times New Roman" w:hAnsi="Times New Roman"/>
-          <w:sz w:val="23"/>
-        </w:rPr>
-        <w:t xml:space="preserve"> into the Redis database without affecting system performance.</w:t>
+        <w:t>, specifically in implementing caching logic for Azure Functions. This ensured uninterrupted record processing and simultaneous caching into the Redis database without affecting system performance.</w:t>
       </w:r>
     </w:p>
     <w:p>
@@ -5444,25 +5308,7 @@
           <w:color w:val="000000"/>
           <w:sz w:val="23"/>
         </w:rPr>
-        <w:t xml:space="preserve">Managed a custom CMS for public content and service integration. Oversaw user information and workflow for citizen problem-solving digital solutions. </w:t>
-      </w:r>
-      <w:proofErr w:type="gramStart"/>
-      <w:r>
-        <w:rPr>
-          <w:rFonts w:ascii="Times New Roman" w:hAnsi="Times New Roman" w:cs="Times New Roman"/>
-          <w:color w:val="000000"/>
-          <w:sz w:val="23"/>
-        </w:rPr>
-        <w:t>Led</w:t>
-      </w:r>
-      <w:proofErr w:type="gramEnd"/>
-      <w:r>
-        <w:rPr>
-          <w:rFonts w:ascii="Times New Roman" w:hAnsi="Times New Roman" w:cs="Times New Roman"/>
-          <w:color w:val="000000"/>
-          <w:sz w:val="23"/>
-        </w:rPr>
-        <w:t xml:space="preserve"> a team of four to develop the portal and integrate power platform services.</w:t>
+        <w:t>Managed a custom CMS for public content and service integration. Oversaw user information and workflow for citizen problem-solving digital solutions. Led a team of four to develop the portal and integrate power platform services.</w:t>
       </w:r>
     </w:p>
     <w:p>
@@ -6719,72 +6565,72 @@
           <w:rFonts w:ascii="Verdana" w:hAnsi="Verdana"/>
           <w:sz w:val="18"/>
         </w:rPr>
-        <w:t xml:space="preserve">Released the portal 3 generations using for constellation by actively contributing </w:t>
-      </w:r>
-      <w:proofErr w:type="gramStart"/>
-      <w:r>
+        <w:t>Released the portal 3 generations using for constellation by actively contributing in front-end and backend development.</w:t>
+      </w:r>
+    </w:p>
+    <w:p>
+      <w:pPr>
+        <w:pStyle w:val="ListParagraph"/>
+        <w:numPr>
+          <w:ilvl w:val="0"/>
+          <w:numId w:val="27"/>
+        </w:numPr>
+        <w:ind w:left="540"/>
         <w:rPr>
           <w:rFonts w:ascii="Verdana" w:hAnsi="Verdana"/>
           <w:sz w:val="18"/>
         </w:rPr>
-        <w:t>in</w:t>
-      </w:r>
-      <w:proofErr w:type="gramEnd"/>
+      </w:pPr>
       <w:r>
         <w:rPr>
           <w:rFonts w:ascii="Verdana" w:hAnsi="Verdana"/>
           <w:sz w:val="18"/>
         </w:rPr>
-        <w:t xml:space="preserve"> front-end and backend development.</w:t>
-      </w:r>
-    </w:p>
-    <w:p>
-      <w:pPr>
-        <w:pStyle w:val="ListParagraph"/>
-        <w:numPr>
-          <w:ilvl w:val="0"/>
-          <w:numId w:val="27"/>
-        </w:numPr>
-        <w:ind w:left="540"/>
+        <w:t>I have</w:t>
+      </w:r>
+      <w:r>
         <w:rPr>
           <w:rFonts w:ascii="Verdana" w:hAnsi="Verdana"/>
           <w:sz w:val="18"/>
         </w:rPr>
-      </w:pPr>
-      <w:r>
+        <w:t xml:space="preserve"> done a lot of research in the caching and improving the performance in web app and database side.</w:t>
+      </w:r>
+    </w:p>
+    <w:p>
+      <w:pPr>
+        <w:pStyle w:val="ListParagraph"/>
+        <w:numPr>
+          <w:ilvl w:val="0"/>
+          <w:numId w:val="27"/>
+        </w:numPr>
+        <w:ind w:left="540"/>
         <w:rPr>
           <w:rFonts w:ascii="Verdana" w:hAnsi="Verdana"/>
           <w:sz w:val="18"/>
         </w:rPr>
-        <w:t>I have</w:t>
-      </w:r>
+      </w:pPr>
       <w:r>
         <w:rPr>
           <w:rFonts w:ascii="Verdana" w:hAnsi="Verdana"/>
           <w:sz w:val="18"/>
         </w:rPr>
-        <w:t xml:space="preserve"> done a lot of research in the caching and improving the performance in web app and database side.</w:t>
-      </w:r>
-    </w:p>
-    <w:p>
-      <w:pPr>
-        <w:pStyle w:val="ListParagraph"/>
-        <w:numPr>
-          <w:ilvl w:val="0"/>
-          <w:numId w:val="27"/>
-        </w:numPr>
-        <w:ind w:left="540"/>
+        <w:t xml:space="preserve">Implemented new </w:t>
+      </w:r>
+      <w:proofErr w:type="spellStart"/>
+      <w:r>
         <w:rPr>
           <w:rFonts w:ascii="Verdana" w:hAnsi="Verdana"/>
           <w:sz w:val="18"/>
         </w:rPr>
-      </w:pPr>
+        <w:t>api</w:t>
+      </w:r>
+      <w:proofErr w:type="spellEnd"/>
       <w:r>
         <w:rPr>
           <w:rFonts w:ascii="Verdana" w:hAnsi="Verdana"/>
           <w:sz w:val="18"/>
         </w:rPr>
-        <w:t xml:space="preserve">Implemented new </w:t>
+        <w:t xml:space="preserve"> and modify existing </w:t>
       </w:r>
       <w:proofErr w:type="spellStart"/>
       <w:r>
@@ -6800,7 +6646,7 @@
           <w:rFonts w:ascii="Verdana" w:hAnsi="Verdana"/>
           <w:sz w:val="18"/>
         </w:rPr>
-        <w:t xml:space="preserve"> and modify existing </w:t>
+        <w:t xml:space="preserve"> which interact with Docusign and </w:t>
       </w:r>
       <w:proofErr w:type="spellStart"/>
       <w:r>
@@ -6808,7 +6654,7 @@
           <w:rFonts w:ascii="Verdana" w:hAnsi="Verdana"/>
           <w:sz w:val="18"/>
         </w:rPr>
-        <w:t>api</w:t>
+        <w:t>dhub</w:t>
       </w:r>
       <w:proofErr w:type="spellEnd"/>
       <w:r>
@@ -6816,74 +6662,112 @@
           <w:rFonts w:ascii="Verdana" w:hAnsi="Verdana"/>
           <w:sz w:val="18"/>
         </w:rPr>
-        <w:t xml:space="preserve"> which interact with Docusign and </w:t>
-      </w:r>
-      <w:proofErr w:type="spellStart"/>
-      <w:r>
+        <w:t xml:space="preserve"> services for contract renewal services.</w:t>
+      </w:r>
+    </w:p>
+    <w:p>
+      <w:pPr>
+        <w:pStyle w:val="ListParagraph"/>
+        <w:numPr>
+          <w:ilvl w:val="0"/>
+          <w:numId w:val="27"/>
+        </w:numPr>
+        <w:ind w:left="540"/>
         <w:rPr>
           <w:rFonts w:ascii="Verdana" w:hAnsi="Verdana"/>
           <w:sz w:val="18"/>
         </w:rPr>
-        <w:t>dhub</w:t>
-      </w:r>
-      <w:proofErr w:type="spellEnd"/>
+      </w:pPr>
       <w:r>
         <w:rPr>
           <w:rFonts w:ascii="Verdana" w:hAnsi="Verdana"/>
           <w:sz w:val="18"/>
         </w:rPr>
-        <w:t xml:space="preserve"> services for contract renewal services.</w:t>
-      </w:r>
-    </w:p>
-    <w:p>
-      <w:pPr>
-        <w:pStyle w:val="ListParagraph"/>
-        <w:numPr>
-          <w:ilvl w:val="0"/>
-          <w:numId w:val="27"/>
-        </w:numPr>
-        <w:ind w:left="540"/>
+        <w:t xml:space="preserve">Creating a separate </w:t>
+      </w:r>
+      <w:r>
         <w:rPr>
           <w:rFonts w:ascii="Verdana" w:hAnsi="Verdana"/>
           <w:sz w:val="18"/>
         </w:rPr>
-      </w:pPr>
+        <w:t>dB context</w:t>
+      </w:r>
       <w:r>
         <w:rPr>
           <w:rFonts w:ascii="Verdana" w:hAnsi="Verdana"/>
           <w:sz w:val="18"/>
         </w:rPr>
-        <w:t xml:space="preserve">Creating a separate </w:t>
+        <w:t xml:space="preserve"> for read and write operation and added </w:t>
       </w:r>
       <w:r>
         <w:rPr>
           <w:rFonts w:ascii="Verdana" w:hAnsi="Verdana"/>
           <w:sz w:val="18"/>
         </w:rPr>
-        <w:t>dB context</w:t>
+        <w:t>replicas</w:t>
       </w:r>
       <w:r>
         <w:rPr>
           <w:rFonts w:ascii="Verdana" w:hAnsi="Verdana"/>
           <w:sz w:val="18"/>
         </w:rPr>
-        <w:t xml:space="preserve"> for read and write operation and added </w:t>
-      </w:r>
-      <w:proofErr w:type="gramStart"/>
-      <w:r>
+        <w:t xml:space="preserve"> in the backend services.</w:t>
+      </w:r>
+    </w:p>
+    <w:p>
+      <w:pPr>
+        <w:pStyle w:val="ListParagraph"/>
+        <w:numPr>
+          <w:ilvl w:val="0"/>
+          <w:numId w:val="27"/>
+        </w:numPr>
+        <w:ind w:left="540"/>
         <w:rPr>
           <w:rFonts w:ascii="Verdana" w:hAnsi="Verdana"/>
           <w:sz w:val="18"/>
         </w:rPr>
-        <w:t>read-replica pattern</w:t>
-      </w:r>
-      <w:proofErr w:type="gramEnd"/>
+      </w:pPr>
       <w:r>
         <w:rPr>
           <w:rFonts w:ascii="Verdana" w:hAnsi="Verdana"/>
           <w:sz w:val="18"/>
         </w:rPr>
-        <w:t xml:space="preserve"> in the backend services.</w:t>
+        <w:t xml:space="preserve">Code refactoring and code folder structure defined and refactor the solution. Also created separate micro-services </w:t>
+      </w:r>
+      <w:r>
+        <w:rPr>
+          <w:rFonts w:ascii="Verdana" w:hAnsi="Verdana"/>
+          <w:sz w:val="18"/>
+        </w:rPr>
+        <w:t>solutions</w:t>
+      </w:r>
+      <w:r>
+        <w:rPr>
+          <w:rFonts w:ascii="Verdana" w:hAnsi="Verdana"/>
+          <w:sz w:val="18"/>
+        </w:rPr>
+        <w:t xml:space="preserve"> and pattern for all the server less architecture and solution.</w:t>
+      </w:r>
+    </w:p>
+    <w:p>
+      <w:pPr>
+        <w:pStyle w:val="ListParagraph"/>
+        <w:numPr>
+          <w:ilvl w:val="0"/>
+          <w:numId w:val="27"/>
+        </w:numPr>
+        <w:ind w:left="540"/>
+        <w:rPr>
+          <w:rFonts w:ascii="Verdana" w:hAnsi="Verdana"/>
+          <w:sz w:val="18"/>
+        </w:rPr>
+      </w:pPr>
+      <w:r>
+        <w:rPr>
+          <w:rFonts w:ascii="Verdana" w:hAnsi="Verdana"/>
+          <w:sz w:val="18"/>
+        </w:rPr>
+        <w:t>Handover the KT to customer teams</w:t>
       </w:r>
     </w:p>
     <w:sectPr>

</xml_diff>